<commit_message>
Update for Nov 2025
</commit_message>
<xml_diff>
--- a/J_Hoeks.docx
+++ b/J_Hoeks.docx
@@ -1,6 +1,6 @@
 
 <file path=word/document.xml><?xml version="1.0" encoding="utf-8"?>
-<w:document xmlns:wpc="http://schemas.microsoft.com/office/word/2010/wordprocessingCanvas" xmlns:cx="http://schemas.microsoft.com/office/drawing/2014/chartex" xmlns:cx1="http://schemas.microsoft.com/office/drawing/2015/9/8/chartex" xmlns:cx2="http://schemas.microsoft.com/office/drawing/2015/10/21/chartex" xmlns:cx3="http://schemas.microsoft.com/office/drawing/2016/5/9/chartex" xmlns:cx4="http://schemas.microsoft.com/office/drawing/2016/5/10/chartex" xmlns:cx5="http://schemas.microsoft.com/office/drawing/2016/5/11/chartex" xmlns:cx6="http://schemas.microsoft.com/office/drawing/2016/5/12/chartex" xmlns:cx7="http://schemas.microsoft.com/office/drawing/2016/5/13/chartex" xmlns:cx8="http://schemas.microsoft.com/office/drawing/2016/5/14/chartex" xmlns:mc="http://schemas.openxmlformats.org/markup-compatibility/2006" xmlns:aink="http://schemas.microsoft.com/office/drawing/2016/ink" xmlns:am3d="http://schemas.microsoft.com/office/drawing/2017/model3d" xmlns:o="urn:schemas-microsoft-com:office:office" xmlns:oel="http://schemas.microsoft.com/office/2019/extlst" xmlns:r="http://schemas.openxmlformats.org/officeDocument/2006/relationships" xmlns:m="http://schemas.openxmlformats.org/officeDocument/2006/math" xmlns:v="urn:schemas-microsoft-com:vml" xmlns:wp14="http://schemas.microsoft.com/office/word/2010/wordprocessingDrawing" xmlns:wp="http://schemas.openxmlformats.org/drawingml/2006/wordprocessingDrawing" xmlns:w10="urn:schemas-microsoft-com:office:word" xmlns:w="http://schemas.openxmlformats.org/wordprocessingml/2006/main" xmlns:w14="http://schemas.microsoft.com/office/word/2010/wordml" xmlns:w15="http://schemas.microsoft.com/office/word/2012/wordml" xmlns:w16cex="http://schemas.microsoft.com/office/word/2018/wordml/cex" xmlns:w16cid="http://schemas.microsoft.com/office/word/2016/wordml/cid" xmlns:w16="http://schemas.microsoft.com/office/word/2018/wordml" xmlns:w16sdtdh="http://schemas.microsoft.com/office/word/2020/wordml/sdtdatahash" xmlns:w16se="http://schemas.microsoft.com/office/word/2015/wordml/symex" xmlns:wpg="http://schemas.microsoft.com/office/word/2010/wordprocessingGroup" xmlns:wpi="http://schemas.microsoft.com/office/word/2010/wordprocessingInk" xmlns:wne="http://schemas.microsoft.com/office/word/2006/wordml" xmlns:wps="http://schemas.microsoft.com/office/word/2010/wordprocessingShape" mc:Ignorable="w14 w15 w16se w16cid w16 w16cex w16sdtdh wp14">
+<w:document xmlns:wpc="http://schemas.microsoft.com/office/word/2010/wordprocessingCanvas" xmlns:cx="http://schemas.microsoft.com/office/drawing/2014/chartex" xmlns:cx1="http://schemas.microsoft.com/office/drawing/2015/9/8/chartex" xmlns:cx2="http://schemas.microsoft.com/office/drawing/2015/10/21/chartex" xmlns:cx3="http://schemas.microsoft.com/office/drawing/2016/5/9/chartex" xmlns:cx4="http://schemas.microsoft.com/office/drawing/2016/5/10/chartex" xmlns:cx5="http://schemas.microsoft.com/office/drawing/2016/5/11/chartex" xmlns:cx6="http://schemas.microsoft.com/office/drawing/2016/5/12/chartex" xmlns:cx7="http://schemas.microsoft.com/office/drawing/2016/5/13/chartex" xmlns:cx8="http://schemas.microsoft.com/office/drawing/2016/5/14/chartex" xmlns:mc="http://schemas.openxmlformats.org/markup-compatibility/2006" xmlns:aink="http://schemas.microsoft.com/office/drawing/2016/ink" xmlns:am3d="http://schemas.microsoft.com/office/drawing/2017/model3d" xmlns:o="urn:schemas-microsoft-com:office:office" xmlns:oel="http://schemas.microsoft.com/office/2019/extlst" xmlns:r="http://schemas.openxmlformats.org/officeDocument/2006/relationships" xmlns:m="http://schemas.openxmlformats.org/officeDocument/2006/math" xmlns:v="urn:schemas-microsoft-com:vml" xmlns:wp14="http://schemas.microsoft.com/office/word/2010/wordprocessingDrawing" xmlns:wp="http://schemas.openxmlformats.org/drawingml/2006/wordprocessingDrawing" xmlns:w10="urn:schemas-microsoft-com:office:word" xmlns:w="http://schemas.openxmlformats.org/wordprocessingml/2006/main" xmlns:w14="http://schemas.microsoft.com/office/word/2010/wordml" xmlns:w15="http://schemas.microsoft.com/office/word/2012/wordml" xmlns:w16cex="http://schemas.microsoft.com/office/word/2018/wordml/cex" xmlns:w16cid="http://schemas.microsoft.com/office/word/2016/wordml/cid" xmlns:w16="http://schemas.microsoft.com/office/word/2018/wordml" xmlns:w16du="http://schemas.microsoft.com/office/word/2023/wordml/word16du" xmlns:w16sdtdh="http://schemas.microsoft.com/office/word/2020/wordml/sdtdatahash" xmlns:w16sdtfl="http://schemas.microsoft.com/office/word/2024/wordml/sdtformatlock" xmlns:w16se="http://schemas.microsoft.com/office/word/2015/wordml/symex" xmlns:wpg="http://schemas.microsoft.com/office/word/2010/wordprocessingGroup" xmlns:wpi="http://schemas.microsoft.com/office/word/2010/wordprocessingInk" xmlns:wne="http://schemas.microsoft.com/office/word/2006/wordml" xmlns:wps="http://schemas.microsoft.com/office/word/2010/wordprocessingShape" mc:Ignorable="w14 w15 w16se w16cid w16 w16cex w16sdtdh w16sdtfl w16du wp14">
   <w:body>
     <w:p>
       <w:pPr>
@@ -202,7 +202,650 @@
           <w:rFonts w:eastAsia="Times New Roman"/>
         </w:rPr>
       </w:pPr>
-      <w:hyperlink r:id="rId12" w:tooltip="Coles site" w:history="1">
+      <w:hyperlink r:id="rId12" w:tooltip="ANZ site" w:history="1">
+        <w:proofErr w:type="spellStart"/>
+        <w:r>
+          <w:rPr>
+            <w:rStyle w:val="Hyperlink"/>
+            <w:b/>
+            <w:bCs/>
+            <w:color w:val="auto"/>
+            <w:shd w:val="clear" w:color="auto" w:fill="FFFFFF"/>
+          </w:rPr>
+          <w:t>ANZx</w:t>
+        </w:r>
+        <w:proofErr w:type="spellEnd"/>
+        <w:r>
+          <w:rPr>
+            <w:rStyle w:val="Hyperlink"/>
+            <w:b/>
+            <w:bCs/>
+            <w:color w:val="auto"/>
+            <w:shd w:val="clear" w:color="auto" w:fill="FFFFFF"/>
+          </w:rPr>
+          <w:t xml:space="preserve"> Digital</w:t>
+        </w:r>
+      </w:hyperlink>
+      <w:r>
+        <w:t xml:space="preserve"> (Contract)</w:t>
+      </w:r>
+      <w:r>
+        <w:rPr>
+          <w:rFonts w:eastAsia="Times New Roman"/>
+        </w:rPr>
+        <w:tab/>
+      </w:r>
+      <w:r>
+        <w:rPr>
+          <w:rFonts w:eastAsia="Times New Roman"/>
+        </w:rPr>
+        <w:t>Jan</w:t>
+      </w:r>
+      <w:r>
+        <w:rPr>
+          <w:rFonts w:eastAsia="Times New Roman"/>
+        </w:rPr>
+        <w:t xml:space="preserve"> 202</w:t>
+      </w:r>
+      <w:r>
+        <w:rPr>
+          <w:rFonts w:eastAsia="Times New Roman"/>
+        </w:rPr>
+        <w:t>5</w:t>
+      </w:r>
+      <w:r>
+        <w:rPr>
+          <w:rFonts w:eastAsia="Times New Roman"/>
+        </w:rPr>
+        <w:t>-</w:t>
+      </w:r>
+      <w:r>
+        <w:rPr>
+          <w:rFonts w:eastAsia="Times New Roman"/>
+        </w:rPr>
+        <w:t>Nov</w:t>
+      </w:r>
+      <w:r>
+        <w:rPr>
+          <w:rFonts w:eastAsia="Times New Roman"/>
+        </w:rPr>
+        <w:t xml:space="preserve"> 202</w:t>
+      </w:r>
+      <w:r>
+        <w:rPr>
+          <w:rFonts w:eastAsia="Times New Roman"/>
+        </w:rPr>
+        <w:t>5</w:t>
+      </w:r>
+      <w:r>
+        <w:rPr>
+          <w:rFonts w:eastAsia="Times New Roman"/>
+        </w:rPr>
+        <w:t xml:space="preserve"> (</w:t>
+      </w:r>
+      <w:r>
+        <w:rPr>
+          <w:rFonts w:eastAsia="Times New Roman"/>
+        </w:rPr>
+        <w:t>11 months</w:t>
+      </w:r>
+      <w:r>
+        <w:rPr>
+          <w:rFonts w:eastAsia="Times New Roman"/>
+        </w:rPr>
+        <w:t>)</w:t>
+      </w:r>
+      <w:r>
+        <w:rPr>
+          <w:rFonts w:eastAsia="Times New Roman"/>
+        </w:rPr>
+        <w:br/>
+      </w:r>
+      <w:r>
+        <w:rPr>
+          <w:rStyle w:val="Emphasis"/>
+          <w:rFonts w:eastAsia="Times New Roman"/>
+        </w:rPr>
+        <w:t xml:space="preserve">Senior </w:t>
+      </w:r>
+      <w:r>
+        <w:rPr>
+          <w:rStyle w:val="Emphasis"/>
+          <w:rFonts w:eastAsia="Times New Roman"/>
+        </w:rPr>
+        <w:t>Software Engineer</w:t>
+      </w:r>
+    </w:p>
+    <w:p>
+      <w:pPr>
+        <w:numPr>
+          <w:ilvl w:val="1"/>
+          <w:numId w:val="2"/>
+        </w:numPr>
+        <w:tabs>
+          <w:tab w:val="clear" w:pos="1440"/>
+          <w:tab w:val="num" w:pos="284"/>
+          <w:tab w:val="right" w:pos="10773"/>
+        </w:tabs>
+        <w:ind w:left="284" w:hanging="284"/>
+        <w:rPr>
+          <w:rStyle w:val="Strong"/>
+          <w:rFonts w:eastAsia="Times New Roman"/>
+          <w:b w:val="0"/>
+          <w:bCs w:val="0"/>
+        </w:rPr>
+      </w:pPr>
+      <w:proofErr w:type="spellStart"/>
+      <w:r>
+        <w:rPr>
+          <w:rStyle w:val="Strong"/>
+          <w:shd w:val="clear" w:color="auto" w:fill="FFFFFF"/>
+        </w:rPr>
+        <w:t>TrustMe</w:t>
+      </w:r>
+      <w:proofErr w:type="spellEnd"/>
+      <w:r>
+        <w:rPr>
+          <w:shd w:val="clear" w:color="auto" w:fill="FFFFFF"/>
+        </w:rPr>
+        <w:t xml:space="preserve"> — </w:t>
+      </w:r>
+      <w:r>
+        <w:rPr>
+          <w:rStyle w:val="Emphasis"/>
+          <w:shd w:val="clear" w:color="auto" w:fill="FFFFFF"/>
+        </w:rPr>
+        <w:t xml:space="preserve">React Query, React Hook Form, Zod, MSW, Experian QAS, </w:t>
+      </w:r>
+      <w:proofErr w:type="spellStart"/>
+      <w:r>
+        <w:rPr>
+          <w:rStyle w:val="Emphasis"/>
+          <w:shd w:val="clear" w:color="auto" w:fill="FFFFFF"/>
+        </w:rPr>
+        <w:t>Turborepo</w:t>
+      </w:r>
+      <w:proofErr w:type="spellEnd"/>
+      <w:r>
+        <w:rPr>
+          <w:rStyle w:val="Emphasis"/>
+          <w:rFonts w:eastAsia="Times New Roman"/>
+          <w:i w:val="0"/>
+          <w:iCs w:val="0"/>
+        </w:rPr>
+        <w:br/>
+      </w:r>
+      <w:r>
+        <w:rPr>
+          <w:shd w:val="clear" w:color="auto" w:fill="FFFFFF"/>
+        </w:rPr>
+        <w:t xml:space="preserve">Given technical ownership of a Single Page Application responsible for Identity Verification as a service used by several clients within the bank; doubling productivity (measured in pages delivered). Key feature delivered is a robust </w:t>
+      </w:r>
+      <w:r>
+        <w:rPr>
+          <w:shd w:val="clear" w:color="auto" w:fill="FFFFFF"/>
+        </w:rPr>
+        <w:t>home</w:t>
+      </w:r>
+      <w:r>
+        <w:rPr>
+          <w:shd w:val="clear" w:color="auto" w:fill="FFFFFF"/>
+        </w:rPr>
+        <w:t xml:space="preserve"> address autocomplete </w:t>
+      </w:r>
+      <w:r>
+        <w:rPr>
+          <w:shd w:val="clear" w:color="auto" w:fill="FFFFFF"/>
+        </w:rPr>
+        <w:t>component</w:t>
+      </w:r>
+      <w:r>
+        <w:rPr>
+          <w:shd w:val="clear" w:color="auto" w:fill="FFFFFF"/>
+        </w:rPr>
+        <w:t xml:space="preserve"> with fallbacks for international and manual address entry.</w:t>
+      </w:r>
+    </w:p>
+    <w:p>
+      <w:pPr>
+        <w:numPr>
+          <w:ilvl w:val="1"/>
+          <w:numId w:val="2"/>
+        </w:numPr>
+        <w:tabs>
+          <w:tab w:val="clear" w:pos="1440"/>
+          <w:tab w:val="num" w:pos="284"/>
+          <w:tab w:val="right" w:pos="10773"/>
+        </w:tabs>
+        <w:ind w:left="284" w:hanging="284"/>
+        <w:rPr>
+          <w:rStyle w:val="Hyperlink"/>
+          <w:rFonts w:eastAsia="Times New Roman"/>
+          <w:color w:val="auto"/>
+        </w:rPr>
+      </w:pPr>
+      <w:r>
+        <w:rPr>
+          <w:rStyle w:val="Strong"/>
+          <w:shd w:val="clear" w:color="auto" w:fill="FFFFFF"/>
+        </w:rPr>
+        <w:t>Bluestone</w:t>
+      </w:r>
+      <w:r>
+        <w:rPr>
+          <w:shd w:val="clear" w:color="auto" w:fill="FFFFFF"/>
+        </w:rPr>
+        <w:t xml:space="preserve"> — </w:t>
+      </w:r>
+      <w:proofErr w:type="spellStart"/>
+      <w:r>
+        <w:rPr>
+          <w:rStyle w:val="Emphasis"/>
+          <w:shd w:val="clear" w:color="auto" w:fill="FFFFFF"/>
+        </w:rPr>
+        <w:t>NextJs</w:t>
+      </w:r>
+      <w:proofErr w:type="spellEnd"/>
+      <w:r>
+        <w:rPr>
+          <w:rStyle w:val="Emphasis"/>
+          <w:shd w:val="clear" w:color="auto" w:fill="FFFFFF"/>
+        </w:rPr>
+        <w:t xml:space="preserve">, Next Intl, React Hook Form, Zod, </w:t>
+      </w:r>
+      <w:proofErr w:type="spellStart"/>
+      <w:r>
+        <w:rPr>
+          <w:rStyle w:val="Emphasis"/>
+          <w:shd w:val="clear" w:color="auto" w:fill="FFFFFF"/>
+        </w:rPr>
+        <w:t>ConnectRPC</w:t>
+      </w:r>
+      <w:proofErr w:type="spellEnd"/>
+      <w:r>
+        <w:rPr>
+          <w:rStyle w:val="Emphasis"/>
+          <w:shd w:val="clear" w:color="auto" w:fill="FFFFFF"/>
+        </w:rPr>
+        <w:t xml:space="preserve">, </w:t>
+      </w:r>
+      <w:proofErr w:type="spellStart"/>
+      <w:r>
+        <w:rPr>
+          <w:rStyle w:val="Emphasis"/>
+          <w:shd w:val="clear" w:color="auto" w:fill="FFFFFF"/>
+        </w:rPr>
+        <w:t>WebAuthn</w:t>
+      </w:r>
+      <w:proofErr w:type="spellEnd"/>
+      <w:r>
+        <w:rPr>
+          <w:rStyle w:val="Emphasis"/>
+          <w:shd w:val="clear" w:color="auto" w:fill="FFFFFF"/>
+        </w:rPr>
+        <w:t xml:space="preserve">, </w:t>
+      </w:r>
+      <w:proofErr w:type="spellStart"/>
+      <w:r>
+        <w:rPr>
+          <w:rStyle w:val="Emphasis"/>
+          <w:shd w:val="clear" w:color="auto" w:fill="FFFFFF"/>
+        </w:rPr>
+        <w:t>Nx</w:t>
+      </w:r>
+      <w:proofErr w:type="spellEnd"/>
+      <w:r>
+        <w:rPr>
+          <w:rStyle w:val="Emphasis"/>
+          <w:rFonts w:eastAsia="Times New Roman"/>
+          <w:i w:val="0"/>
+          <w:iCs w:val="0"/>
+        </w:rPr>
+        <w:br/>
+      </w:r>
+      <w:r>
+        <w:rPr>
+          <w:shd w:val="clear" w:color="auto" w:fill="FFFFFF"/>
+        </w:rPr>
+        <w:t xml:space="preserve">Supported development of an Existing to Bank customer migration application (ETB) featuring </w:t>
+      </w:r>
+      <w:proofErr w:type="spellStart"/>
+      <w:r>
+        <w:rPr>
+          <w:shd w:val="clear" w:color="auto" w:fill="FFFFFF"/>
+        </w:rPr>
+        <w:t>choose+enter</w:t>
+      </w:r>
+      <w:proofErr w:type="spellEnd"/>
+      <w:r>
+        <w:rPr>
+          <w:shd w:val="clear" w:color="auto" w:fill="FFFFFF"/>
+        </w:rPr>
+        <w:t xml:space="preserve"> One-Time Passwords</w:t>
+      </w:r>
+      <w:r>
+        <w:rPr>
+          <w:shd w:val="clear" w:color="auto" w:fill="FFFFFF"/>
+        </w:rPr>
+        <w:t>.</w:t>
+      </w:r>
+      <w:r>
+        <w:rPr>
+          <w:shd w:val="clear" w:color="auto" w:fill="FFFFFF"/>
+        </w:rPr>
+        <w:t xml:space="preserve"> Notably implemented a passkey registration flow (login with fingerprint) using the </w:t>
+      </w:r>
+      <w:proofErr w:type="spellStart"/>
+      <w:r>
+        <w:rPr>
+          <w:shd w:val="clear" w:color="auto" w:fill="FFFFFF"/>
+        </w:rPr>
+        <w:t>WebAuthn</w:t>
+      </w:r>
+      <w:proofErr w:type="spellEnd"/>
+      <w:r>
+        <w:rPr>
+          <w:shd w:val="clear" w:color="auto" w:fill="FFFFFF"/>
+        </w:rPr>
+        <w:t xml:space="preserve"> spec. Part of the Claude AI trial for agentic coding to </w:t>
+      </w:r>
+      <w:r>
+        <w:rPr>
+          <w:shd w:val="clear" w:color="auto" w:fill="FFFFFF"/>
+        </w:rPr>
+        <w:t>boost</w:t>
+      </w:r>
+      <w:r>
+        <w:rPr>
+          <w:shd w:val="clear" w:color="auto" w:fill="FFFFFF"/>
+        </w:rPr>
+        <w:t xml:space="preserve"> unit test coverage and documentation. </w:t>
+      </w:r>
+    </w:p>
+    <w:p>
+      <w:pPr>
+        <w:tabs>
+          <w:tab w:val="right" w:pos="10773"/>
+        </w:tabs>
+        <w:spacing w:before="240"/>
+        <w:rPr>
+          <w:rFonts w:eastAsia="Times New Roman"/>
+        </w:rPr>
+      </w:pPr>
+      <w:hyperlink r:id="rId13" w:tooltip="Origin site" w:history="1">
+        <w:r>
+          <w:rPr>
+            <w:rStyle w:val="Hyperlink"/>
+            <w:b/>
+            <w:bCs/>
+            <w:color w:val="auto"/>
+            <w:shd w:val="clear" w:color="auto" w:fill="FFFFFF"/>
+          </w:rPr>
+          <w:t>Origin Energy</w:t>
+        </w:r>
+      </w:hyperlink>
+      <w:r>
+        <w:t xml:space="preserve"> (Contract)</w:t>
+      </w:r>
+      <w:r>
+        <w:rPr>
+          <w:rFonts w:eastAsia="Times New Roman"/>
+        </w:rPr>
+        <w:tab/>
+      </w:r>
+      <w:r>
+        <w:rPr>
+          <w:rFonts w:eastAsia="Times New Roman"/>
+        </w:rPr>
+        <w:t>Dec</w:t>
+      </w:r>
+      <w:r>
+        <w:rPr>
+          <w:rFonts w:eastAsia="Times New Roman"/>
+        </w:rPr>
+        <w:t xml:space="preserve"> 202</w:t>
+      </w:r>
+      <w:r>
+        <w:rPr>
+          <w:rFonts w:eastAsia="Times New Roman"/>
+        </w:rPr>
+        <w:t>3</w:t>
+      </w:r>
+      <w:r>
+        <w:rPr>
+          <w:rFonts w:eastAsia="Times New Roman"/>
+        </w:rPr>
+        <w:t>-</w:t>
+      </w:r>
+      <w:r>
+        <w:rPr>
+          <w:rFonts w:eastAsia="Times New Roman"/>
+        </w:rPr>
+        <w:t>Jan</w:t>
+      </w:r>
+      <w:r>
+        <w:rPr>
+          <w:rFonts w:eastAsia="Times New Roman"/>
+        </w:rPr>
+        <w:t xml:space="preserve"> 202</w:t>
+      </w:r>
+      <w:r>
+        <w:rPr>
+          <w:rFonts w:eastAsia="Times New Roman"/>
+        </w:rPr>
+        <w:t>5</w:t>
+      </w:r>
+      <w:r>
+        <w:rPr>
+          <w:rFonts w:eastAsia="Times New Roman"/>
+        </w:rPr>
+        <w:t xml:space="preserve"> (</w:t>
+      </w:r>
+      <w:r>
+        <w:rPr>
+          <w:rFonts w:eastAsia="Times New Roman"/>
+        </w:rPr>
+        <w:t>1</w:t>
+      </w:r>
+      <w:r>
+        <w:rPr>
+          <w:rFonts w:eastAsia="Times New Roman"/>
+        </w:rPr>
+        <w:t xml:space="preserve"> year, </w:t>
+      </w:r>
+      <w:r>
+        <w:rPr>
+          <w:rFonts w:eastAsia="Times New Roman"/>
+        </w:rPr>
+        <w:t>1</w:t>
+      </w:r>
+      <w:r>
+        <w:rPr>
+          <w:rFonts w:eastAsia="Times New Roman"/>
+        </w:rPr>
+        <w:t xml:space="preserve"> month)</w:t>
+      </w:r>
+      <w:r>
+        <w:rPr>
+          <w:rFonts w:eastAsia="Times New Roman"/>
+        </w:rPr>
+        <w:br/>
+      </w:r>
+      <w:r>
+        <w:rPr>
+          <w:rStyle w:val="Emphasis"/>
+          <w:rFonts w:eastAsia="Times New Roman"/>
+        </w:rPr>
+        <w:t xml:space="preserve">Senior </w:t>
+      </w:r>
+      <w:r>
+        <w:rPr>
+          <w:rStyle w:val="Emphasis"/>
+          <w:rFonts w:eastAsia="Times New Roman"/>
+        </w:rPr>
+        <w:t>Software Engineer</w:t>
+      </w:r>
+    </w:p>
+    <w:p>
+      <w:pPr>
+        <w:numPr>
+          <w:ilvl w:val="1"/>
+          <w:numId w:val="2"/>
+        </w:numPr>
+        <w:tabs>
+          <w:tab w:val="clear" w:pos="1440"/>
+          <w:tab w:val="num" w:pos="284"/>
+          <w:tab w:val="right" w:pos="10773"/>
+        </w:tabs>
+        <w:ind w:left="284" w:hanging="284"/>
+        <w:rPr>
+          <w:rStyle w:val="Strong"/>
+          <w:rFonts w:eastAsia="Times New Roman"/>
+          <w:b w:val="0"/>
+          <w:bCs w:val="0"/>
+        </w:rPr>
+      </w:pPr>
+      <w:r>
+        <w:rPr>
+          <w:rStyle w:val="Strong"/>
+          <w:shd w:val="clear" w:color="auto" w:fill="FFFFFF"/>
+        </w:rPr>
+        <w:t>Origin Zero</w:t>
+      </w:r>
+      <w:r>
+        <w:rPr>
+          <w:shd w:val="clear" w:color="auto" w:fill="FFFFFF"/>
+        </w:rPr>
+        <w:t xml:space="preserve"> — </w:t>
+      </w:r>
+      <w:r>
+        <w:rPr>
+          <w:rStyle w:val="Emphasis"/>
+          <w:shd w:val="clear" w:color="auto" w:fill="FFFFFF"/>
+        </w:rPr>
+        <w:t>React, React Query, React Intl, Material UI, Auth0</w:t>
+      </w:r>
+      <w:r>
+        <w:rPr>
+          <w:rStyle w:val="Emphasis"/>
+          <w:rFonts w:eastAsia="Times New Roman"/>
+          <w:i w:val="0"/>
+          <w:iCs w:val="0"/>
+        </w:rPr>
+        <w:br/>
+      </w:r>
+      <w:r>
+        <w:rPr>
+          <w:rStyle w:val="Strong"/>
+          <w:rFonts w:eastAsia="Times New Roman"/>
+          <w:b w:val="0"/>
+          <w:bCs w:val="0"/>
+        </w:rPr>
+        <w:t>Developed an internal B2B Single Page Application designed to monitor gas and energy usage of multi-site business clients (small, medium and large). Supported multiple authentication methods using Auth0.</w:t>
+      </w:r>
+    </w:p>
+    <w:p>
+      <w:pPr>
+        <w:numPr>
+          <w:ilvl w:val="1"/>
+          <w:numId w:val="2"/>
+        </w:numPr>
+        <w:tabs>
+          <w:tab w:val="clear" w:pos="1440"/>
+          <w:tab w:val="num" w:pos="284"/>
+          <w:tab w:val="right" w:pos="10773"/>
+        </w:tabs>
+        <w:ind w:left="284" w:hanging="284"/>
+        <w:rPr>
+          <w:rFonts w:eastAsia="Times New Roman"/>
+        </w:rPr>
+      </w:pPr>
+      <w:r>
+        <w:rPr>
+          <w:rStyle w:val="Strong"/>
+          <w:shd w:val="clear" w:color="auto" w:fill="FFFFFF"/>
+        </w:rPr>
+        <w:t>Digital Energy Sales Agreements</w:t>
+      </w:r>
+      <w:r>
+        <w:rPr>
+          <w:shd w:val="clear" w:color="auto" w:fill="FFFFFF"/>
+        </w:rPr>
+        <w:t xml:space="preserve"> — </w:t>
+      </w:r>
+      <w:r>
+        <w:rPr>
+          <w:rStyle w:val="Emphasis"/>
+          <w:shd w:val="clear" w:color="auto" w:fill="FFFFFF"/>
+        </w:rPr>
+        <w:t xml:space="preserve">React, </w:t>
+      </w:r>
+      <w:r>
+        <w:rPr>
+          <w:rStyle w:val="Emphasis"/>
+          <w:shd w:val="clear" w:color="auto" w:fill="FFFFFF"/>
+        </w:rPr>
+        <w:t xml:space="preserve">React Query, </w:t>
+      </w:r>
+      <w:r>
+        <w:rPr>
+          <w:rStyle w:val="Emphasis"/>
+          <w:shd w:val="clear" w:color="auto" w:fill="FFFFFF"/>
+        </w:rPr>
+        <w:t xml:space="preserve">Material UI, Styled Components, </w:t>
+      </w:r>
+      <w:proofErr w:type="spellStart"/>
+      <w:r>
+        <w:rPr>
+          <w:rStyle w:val="Emphasis"/>
+          <w:shd w:val="clear" w:color="auto" w:fill="FFFFFF"/>
+        </w:rPr>
+        <w:t>NextJS</w:t>
+      </w:r>
+      <w:proofErr w:type="spellEnd"/>
+      <w:r>
+        <w:rPr>
+          <w:rStyle w:val="Emphasis"/>
+          <w:shd w:val="clear" w:color="auto" w:fill="FFFFFF"/>
+        </w:rPr>
+        <w:t xml:space="preserve">, </w:t>
+      </w:r>
+      <w:proofErr w:type="spellStart"/>
+      <w:r>
+        <w:rPr>
+          <w:rStyle w:val="Emphasis"/>
+          <w:shd w:val="clear" w:color="auto" w:fill="FFFFFF"/>
+        </w:rPr>
+        <w:t>Nx</w:t>
+      </w:r>
+      <w:proofErr w:type="spellEnd"/>
+      <w:r>
+        <w:rPr>
+          <w:rStyle w:val="Emphasis"/>
+          <w:rFonts w:eastAsia="Times New Roman"/>
+          <w:i w:val="0"/>
+          <w:iCs w:val="0"/>
+        </w:rPr>
+        <w:br/>
+      </w:r>
+      <w:r>
+        <w:rPr>
+          <w:rFonts w:eastAsia="Times New Roman"/>
+        </w:rPr>
+        <w:t>Replaced sequential imperative API calls (throughout React effect blocks) in a data-heavy energy sales dashboard with declarative React Query hooks, significantly reducing cycle time of development/debugging.</w:t>
+      </w:r>
+    </w:p>
+    <w:p>
+      <w:pPr>
+        <w:tabs>
+          <w:tab w:val="right" w:pos="10773"/>
+        </w:tabs>
+        <w:spacing w:before="240"/>
+        <w:rPr>
+          <w:rFonts w:eastAsia="Times New Roman"/>
+        </w:rPr>
+      </w:pPr>
+      <w:hyperlink r:id="rId14" w:tooltip="Coles site" w:history="1">
         <w:r>
           <w:rPr>
             <w:rStyle w:val="Hyperlink"/>
@@ -455,7 +1098,19 @@
         <w:rPr>
           <w:shd w:val="clear" w:color="auto" w:fill="FFFFFF"/>
         </w:rPr>
-        <w:t xml:space="preserve"> at Coles, building a microservice capable of complex querying and orchestration for use across web and mobile app squads. Worked with architects and solution designers to deploy a NodeJS based container into a Kubernetes cluster with CI/CD pipelines for quick and reliable testing and deployments.</w:t>
+        <w:t xml:space="preserve"> at Coles, building a microservice capable of complex querying and orchestration for use across web and mobile app squads. </w:t>
+      </w:r>
+      <w:r>
+        <w:rPr>
+          <w:shd w:val="clear" w:color="auto" w:fill="FFFFFF"/>
+        </w:rPr>
+        <w:t>Implemented 30% coverage of existing APIs within two months</w:t>
+      </w:r>
+      <w:r>
+        <w:rPr>
+          <w:shd w:val="clear" w:color="auto" w:fill="FFFFFF"/>
+        </w:rPr>
+        <w:t>.</w:t>
       </w:r>
     </w:p>
     <w:p>
@@ -547,7 +1202,7 @@
           <w:rFonts w:eastAsia="Times New Roman"/>
         </w:rPr>
       </w:pPr>
-      <w:hyperlink r:id="rId13" w:tooltip="Belong site" w:history="1">
+      <w:hyperlink r:id="rId15" w:tooltip="Belong site" w:history="1">
         <w:r>
           <w:rPr>
             <w:rStyle w:val="Hyperlink"/>
@@ -817,7 +1472,9 @@
         </w:tabs>
         <w:ind w:left="284" w:hanging="284"/>
         <w:rPr>
-          <w:rFonts w:eastAsia="Times New Roman"/>
+          <w:rStyle w:val="Hyperlink"/>
+          <w:rFonts w:eastAsia="Times New Roman"/>
+          <w:color w:val="auto"/>
         </w:rPr>
       </w:pPr>
       <w:r>
@@ -893,28 +1550,6 @@
     </w:p>
     <w:p>
       <w:pPr>
-        <w:spacing w:line="240" w:lineRule="auto"/>
-        <w:rPr>
-          <w:rStyle w:val="Hyperlink"/>
-          <w:b/>
-          <w:bCs/>
-          <w:color w:val="auto"/>
-          <w:shd w:val="clear" w:color="auto" w:fill="FFFFFF"/>
-        </w:rPr>
-      </w:pPr>
-      <w:r>
-        <w:rPr>
-          <w:rStyle w:val="Hyperlink"/>
-          <w:b/>
-          <w:bCs/>
-          <w:color w:val="auto"/>
-          <w:shd w:val="clear" w:color="auto" w:fill="FFFFFF"/>
-        </w:rPr>
-        <w:br w:type="page"/>
-      </w:r>
-    </w:p>
-    <w:p>
-      <w:pPr>
         <w:tabs>
           <w:tab w:val="right" w:pos="10773"/>
         </w:tabs>
@@ -923,7 +1558,7 @@
           <w:rFonts w:eastAsia="Times New Roman"/>
         </w:rPr>
       </w:pPr>
-      <w:hyperlink r:id="rId14" w:tooltip="ANZ site" w:history="1">
+      <w:hyperlink r:id="rId16" w:tooltip="ANZ site" w:history="1">
         <w:r>
           <w:rPr>
             <w:rStyle w:val="Hyperlink"/>
@@ -1064,78 +1699,15 @@
     </w:p>
     <w:p>
       <w:pPr>
-        <w:numPr>
-          <w:ilvl w:val="1"/>
-          <w:numId w:val="2"/>
-        </w:numPr>
-        <w:tabs>
-          <w:tab w:val="clear" w:pos="1440"/>
-          <w:tab w:val="num" w:pos="284"/>
+        <w:tabs>
           <w:tab w:val="right" w:pos="10773"/>
         </w:tabs>
-        <w:ind w:left="284" w:hanging="284"/>
-        <w:rPr>
-          <w:rFonts w:eastAsia="Times New Roman"/>
-        </w:rPr>
-      </w:pPr>
-      <w:r>
-        <w:rPr>
-          <w:rStyle w:val="Strong"/>
-          <w:shd w:val="clear" w:color="auto" w:fill="FFFFFF"/>
-        </w:rPr>
-        <w:t>Personal Loans</w:t>
-      </w:r>
-      <w:r>
-        <w:rPr>
-          <w:shd w:val="clear" w:color="auto" w:fill="FFFFFF"/>
-        </w:rPr>
-        <w:t xml:space="preserve"> — </w:t>
-      </w:r>
-      <w:r>
-        <w:rPr>
-          <w:i/>
-          <w:iCs/>
-          <w:shd w:val="clear" w:color="auto" w:fill="FFFFFF"/>
-        </w:rPr>
-        <w:t>AngularJS, Bamboo CI/CD</w:t>
-      </w:r>
-      <w:r>
-        <w:rPr>
-          <w:rStyle w:val="Emphasis"/>
-          <w:shd w:val="clear" w:color="auto" w:fill="FFFFFF"/>
-        </w:rPr>
-        <w:br/>
-      </w:r>
-      <w:r>
-        <w:rPr>
-          <w:shd w:val="clear" w:color="auto" w:fill="FFFFFF"/>
-        </w:rPr>
-        <w:t>Part of project team implementing Banking Royal Commission requirements. Challenges include working on a legacy AngularJS codebase and conforming to strict regulatory r</w:t>
-      </w:r>
-      <w:r>
-        <w:rPr>
-          <w:shd w:val="clear" w:color="auto" w:fill="FFFFFF"/>
-        </w:rPr>
-        <w:t>equirements around code changes</w:t>
-      </w:r>
-      <w:r>
-        <w:rPr>
-          <w:shd w:val="clear" w:color="auto" w:fill="FFFFFF"/>
-        </w:rPr>
-        <w:t>.</w:t>
-      </w:r>
-    </w:p>
-    <w:p>
-      <w:pPr>
-        <w:tabs>
-          <w:tab w:val="right" w:pos="10773"/>
-        </w:tabs>
         <w:spacing w:before="240"/>
         <w:rPr>
           <w:rFonts w:eastAsia="Times New Roman"/>
         </w:rPr>
       </w:pPr>
-      <w:hyperlink r:id="rId15" w:tooltip="NAB site" w:history="1">
+      <w:hyperlink r:id="rId17" w:tooltip="NAB site" w:history="1">
         <w:r>
           <w:rPr>
             <w:rStyle w:val="Hyperlink"/>
@@ -1331,7 +1903,7 @@
         </w:rPr>
         <w:t xml:space="preserve">Championed development of floating “chat with an agent now” component on </w:t>
       </w:r>
-      <w:hyperlink r:id="rId16" w:history="1">
+      <w:hyperlink r:id="rId18" w:history="1">
         <w:r>
           <w:rPr>
             <w:rStyle w:val="Hyperlink"/>
@@ -1347,7 +1919,7 @@
         </w:rPr>
         <w:t xml:space="preserve"> and </w:t>
       </w:r>
-      <w:hyperlink r:id="rId17" w:history="1">
+      <w:hyperlink r:id="rId19" w:history="1">
         <w:r>
           <w:rPr>
             <w:rStyle w:val="Hyperlink"/>
@@ -1380,144 +1952,26 @@
     </w:p>
     <w:p>
       <w:pPr>
-        <w:numPr>
-          <w:ilvl w:val="1"/>
-          <w:numId w:val="2"/>
-        </w:numPr>
-        <w:tabs>
-          <w:tab w:val="clear" w:pos="1440"/>
-          <w:tab w:val="num" w:pos="284"/>
+        <w:pStyle w:val="Heading2"/>
+        <w:tabs>
+          <w:tab w:val="right" w:pos="10773"/>
         </w:tabs>
         <w:ind w:left="284" w:hanging="284"/>
         <w:rPr>
           <w:rFonts w:eastAsia="Times New Roman"/>
-        </w:rPr>
-      </w:pPr>
-      <w:r>
-        <w:rPr>
-          <w:rStyle w:val="Strong"/>
-          <w:shd w:val="clear" w:color="auto" w:fill="FFFFFF"/>
-        </w:rPr>
-        <w:t>Electronic forms capability</w:t>
-      </w:r>
-      <w:r>
-        <w:rPr>
-          <w:shd w:val="clear" w:color="auto" w:fill="FFFFFF"/>
-        </w:rPr>
-        <w:t xml:space="preserve"> — </w:t>
-      </w:r>
-      <w:r>
-        <w:rPr>
-          <w:rStyle w:val="Emphasis"/>
-          <w:shd w:val="clear" w:color="auto" w:fill="FFFFFF"/>
-        </w:rPr>
-        <w:t>TypeScript, AngularJS, Sass, React, Redux, Storybook, Jenkins</w:t>
-      </w:r>
-      <w:r>
-        <w:rPr>
-          <w:rStyle w:val="Emphasis"/>
-          <w:shd w:val="clear" w:color="auto" w:fill="FFFFFF"/>
-        </w:rPr>
-        <w:br/>
-      </w:r>
-      <w:r>
-        <w:rPr>
-          <w:shd w:val="clear" w:color="auto" w:fill="FFFFFF"/>
-        </w:rPr>
-        <w:t xml:space="preserve">Developed a platform which generates forms for products like </w:t>
-      </w:r>
-      <w:hyperlink r:id="rId18" w:anchor="?products=nab-rewards-platinum-card&amp;campaignCode=MSK" w:history="1">
-        <w:r>
-          <w:rPr>
-            <w:rStyle w:val="Hyperlink"/>
-            <w:color w:val="auto"/>
-            <w:shd w:val="clear" w:color="auto" w:fill="FFFFFF"/>
-          </w:rPr>
-          <w:t>credit cards</w:t>
-        </w:r>
-      </w:hyperlink>
-      <w:r>
-        <w:rPr>
-          <w:shd w:val="clear" w:color="auto" w:fill="FFFFFF"/>
-        </w:rPr>
-        <w:t xml:space="preserve">, </w:t>
-      </w:r>
-      <w:hyperlink r:id="rId19" w:anchor="?products=nab-classic-banking-account" w:history="1">
-        <w:r>
-          <w:rPr>
-            <w:rStyle w:val="Hyperlink"/>
-            <w:color w:val="auto"/>
-            <w:shd w:val="clear" w:color="auto" w:fill="FFFFFF"/>
-          </w:rPr>
-          <w:t>transaction accounts</w:t>
-        </w:r>
-      </w:hyperlink>
-      <w:r>
-        <w:rPr>
-          <w:shd w:val="clear" w:color="auto" w:fill="FFFFFF"/>
-        </w:rPr>
-        <w:t xml:space="preserve">, and </w:t>
-      </w:r>
-      <w:hyperlink r:id="rId20" w:anchor="?products=personal-loan" w:history="1">
-        <w:r>
-          <w:rPr>
-            <w:rStyle w:val="Hyperlink"/>
-            <w:color w:val="auto"/>
-            <w:shd w:val="clear" w:color="auto" w:fill="FFFFFF"/>
-          </w:rPr>
-          <w:t>personal loans</w:t>
-        </w:r>
-      </w:hyperlink>
-      <w:r>
-        <w:rPr>
-          <w:shd w:val="clear" w:color="auto" w:fill="FFFFFF"/>
-        </w:rPr>
-        <w:t>. Responsible for improving the continuous delivery pipeline via Jenkins to reduce build failures by an order of magnitude. Key role in migrating platform components from AngularJS to React and Redux.</w:t>
+          <w:color w:val="auto"/>
+        </w:rPr>
+      </w:pPr>
+      <w:r>
+        <w:rPr>
+          <w:rFonts w:eastAsia="Times New Roman"/>
+          <w:color w:val="auto"/>
+        </w:rPr>
+        <w:t>Technologies</w:t>
       </w:r>
     </w:p>
     <w:p>
       <w:pPr>
-        <w:spacing w:line="240" w:lineRule="auto"/>
-      </w:pPr>
-    </w:p>
-    <w:p>
-      <w:pPr>
-        <w:tabs>
-          <w:tab w:val="right" w:pos="10773"/>
-        </w:tabs>
-        <w:rPr>
-          <w:rFonts w:eastAsia="Times New Roman"/>
-        </w:rPr>
-      </w:pPr>
-      <w:r>
-        <w:rPr>
-          <w:rFonts w:eastAsia="Times New Roman"/>
-        </w:rPr>
-        <w:t>Prior experience available on request.</w:t>
-      </w:r>
-    </w:p>
-    <w:p>
-      <w:pPr>
-        <w:pStyle w:val="Heading2"/>
-        <w:tabs>
-          <w:tab w:val="right" w:pos="10773"/>
-        </w:tabs>
-        <w:ind w:left="284" w:hanging="284"/>
-        <w:rPr>
-          <w:rFonts w:eastAsia="Times New Roman"/>
-          <w:color w:val="auto"/>
-        </w:rPr>
-      </w:pPr>
-      <w:r>
-        <w:rPr>
-          <w:rFonts w:eastAsia="Times New Roman"/>
-          <w:color w:val="auto"/>
-        </w:rPr>
-        <w:t>Technologies</w:t>
-      </w:r>
-    </w:p>
-    <w:p>
-      <w:pPr>
         <w:tabs>
           <w:tab w:val="left" w:pos="6885"/>
           <w:tab w:val="left" w:pos="9315"/>
@@ -1534,7 +1988,7 @@
           <w:rFonts w:eastAsia="Times New Roman"/>
           <w:shd w:val="clear" w:color="auto" w:fill="EEEEEE"/>
         </w:rPr>
-        <w:t>Azure</w:t>
+        <w:t>Docker</w:t>
       </w:r>
       <w:r>
         <w:rPr>
@@ -1547,7 +2001,7 @@
           <w:rFonts w:eastAsia="Times New Roman"/>
           <w:shd w:val="clear" w:color="auto" w:fill="EEEEEE"/>
         </w:rPr>
-        <w:t>Docker</w:t>
+        <w:t>Experian QAS</w:t>
       </w:r>
       <w:r>
         <w:rPr>
@@ -1560,8 +2014,17 @@
           <w:rFonts w:eastAsia="Times New Roman"/>
           <w:shd w:val="clear" w:color="auto" w:fill="EEEEEE"/>
         </w:rPr>
-        <w:t>Experian QAS</w:t>
-      </w:r>
+        <w:t xml:space="preserve"> </w:t>
+      </w:r>
+      <w:proofErr w:type="spellStart"/>
+      <w:r>
+        <w:rPr>
+          <w:rFonts w:eastAsia="Times New Roman"/>
+          <w:shd w:val="clear" w:color="auto" w:fill="EEEEEE"/>
+        </w:rPr>
+        <w:t>GraphQL</w:t>
+      </w:r>
+      <w:proofErr w:type="spellEnd"/>
       <w:r>
         <w:rPr>
           <w:rFonts w:eastAsia="Times New Roman"/>
@@ -1573,7 +2036,7 @@
           <w:rFonts w:eastAsia="Times New Roman"/>
           <w:shd w:val="clear" w:color="auto" w:fill="EEEEEE"/>
         </w:rPr>
-        <w:t>Express.js</w:t>
+        <w:t>Launch Darkly</w:t>
       </w:r>
       <w:r>
         <w:rPr>
@@ -1581,19 +2044,45 @@
         </w:rPr>
         <w:t> </w:t>
       </w:r>
+      <w:r>
+        <w:rPr>
+          <w:rFonts w:eastAsia="Times New Roman"/>
+          <w:shd w:val="clear" w:color="auto" w:fill="EEEEEE"/>
+        </w:rPr>
+        <w:t xml:space="preserve"> </w:t>
+      </w:r>
+      <w:r>
+        <w:rPr>
+          <w:rFonts w:eastAsia="Times New Roman"/>
+          <w:shd w:val="clear" w:color="auto" w:fill="EEEEEE"/>
+        </w:rPr>
+        <w:t>Material UI</w:t>
+      </w:r>
+      <w:r>
+        <w:rPr>
+          <w:rFonts w:eastAsia="Times New Roman"/>
+        </w:rPr>
+        <w:t> </w:t>
+      </w:r>
       <w:proofErr w:type="spellStart"/>
       <w:r>
         <w:rPr>
           <w:rFonts w:eastAsia="Times New Roman"/>
           <w:shd w:val="clear" w:color="auto" w:fill="EEEEEE"/>
         </w:rPr>
-        <w:t>GraphQL</w:t>
+        <w:t>NextJS</w:t>
       </w:r>
       <w:proofErr w:type="spellEnd"/>
       <w:r>
         <w:rPr>
           <w:rFonts w:eastAsia="Times New Roman"/>
         </w:rPr>
+        <w:t xml:space="preserve"> </w:t>
+      </w:r>
+      <w:r>
+        <w:rPr>
+          <w:rFonts w:eastAsia="Times New Roman"/>
+        </w:rPr>
         <w:t> </w:t>
       </w:r>
       <w:r>
@@ -1601,7 +2090,7 @@
           <w:rFonts w:eastAsia="Times New Roman"/>
           <w:shd w:val="clear" w:color="auto" w:fill="EEEEEE"/>
         </w:rPr>
-        <w:t>Launch Darkly</w:t>
+        <w:t>React</w:t>
       </w:r>
       <w:r>
         <w:rPr>
@@ -1609,15 +2098,20 @@
         </w:rPr>
         <w:t> </w:t>
       </w:r>
-      <w:proofErr w:type="spellStart"/>
       <w:r>
         <w:rPr>
           <w:rFonts w:eastAsia="Times New Roman"/>
           <w:shd w:val="clear" w:color="auto" w:fill="EEEEEE"/>
         </w:rPr>
-        <w:t>NextJS</w:t>
-      </w:r>
-      <w:proofErr w:type="spellEnd"/>
+        <w:t>Re</w:t>
+      </w:r>
+      <w:r>
+        <w:rPr>
+          <w:rFonts w:eastAsia="Times New Roman"/>
+          <w:shd w:val="clear" w:color="auto" w:fill="EEEEEE"/>
+        </w:rPr>
+        <w:t>dis</w:t>
+      </w:r>
       <w:r>
         <w:rPr>
           <w:rFonts w:eastAsia="Times New Roman"/>
@@ -1629,88 +2123,20 @@
           <w:rFonts w:eastAsia="Times New Roman"/>
           <w:shd w:val="clear" w:color="auto" w:fill="EEEEEE"/>
         </w:rPr>
-        <w:t>Node</w:t>
+        <w:t>Redux</w:t>
+      </w:r>
+      <w:r>
+        <w:rPr>
+          <w:rFonts w:eastAsia="Times New Roman"/>
+        </w:rPr>
+        <w:t> </w:t>
       </w:r>
       <w:r>
         <w:rPr>
           <w:rFonts w:eastAsia="Times New Roman"/>
           <w:shd w:val="clear" w:color="auto" w:fill="EEEEEE"/>
         </w:rPr>
-        <w:t>JS</w:t>
-      </w:r>
-      <w:r>
-        <w:rPr>
-          <w:rFonts w:eastAsia="Times New Roman"/>
-        </w:rPr>
-        <w:t> </w:t>
-      </w:r>
-      <w:r>
-        <w:rPr>
-          <w:rFonts w:eastAsia="Times New Roman"/>
-          <w:shd w:val="clear" w:color="auto" w:fill="EEEEEE"/>
-        </w:rPr>
-        <w:t>React</w:t>
-      </w:r>
-      <w:r>
-        <w:rPr>
-          <w:rFonts w:eastAsia="Times New Roman"/>
-        </w:rPr>
-        <w:t> </w:t>
-      </w:r>
-      <w:r>
-        <w:rPr>
-          <w:rFonts w:eastAsia="Times New Roman"/>
-          <w:shd w:val="clear" w:color="auto" w:fill="EEEEEE"/>
-        </w:rPr>
-        <w:t>Re</w:t>
-      </w:r>
-      <w:r>
-        <w:rPr>
-          <w:rFonts w:eastAsia="Times New Roman"/>
-          <w:shd w:val="clear" w:color="auto" w:fill="EEEEEE"/>
-        </w:rPr>
-        <w:t>dis</w:t>
-      </w:r>
-      <w:r>
-        <w:rPr>
-          <w:rFonts w:eastAsia="Times New Roman"/>
-        </w:rPr>
-        <w:t> </w:t>
-      </w:r>
-      <w:r>
-        <w:rPr>
-          <w:rFonts w:eastAsia="Times New Roman"/>
-          <w:shd w:val="clear" w:color="auto" w:fill="EEEEEE"/>
-        </w:rPr>
-        <w:t>Redux</w:t>
-      </w:r>
-      <w:r>
-        <w:rPr>
-          <w:rFonts w:eastAsia="Times New Roman"/>
-        </w:rPr>
-        <w:t> </w:t>
-      </w:r>
-      <w:proofErr w:type="spellStart"/>
-      <w:r>
-        <w:rPr>
-          <w:rFonts w:eastAsia="Times New Roman"/>
-          <w:shd w:val="clear" w:color="auto" w:fill="EEEEEE"/>
-        </w:rPr>
-        <w:t>Redux</w:t>
-      </w:r>
-      <w:proofErr w:type="spellEnd"/>
-      <w:r>
-        <w:rPr>
-          <w:rFonts w:eastAsia="Times New Roman"/>
-          <w:shd w:val="clear" w:color="auto" w:fill="EEEEEE"/>
-        </w:rPr>
-        <w:t xml:space="preserve"> Toolkit</w:t>
-      </w:r>
-      <w:r>
-        <w:rPr>
-          <w:rFonts w:eastAsia="Times New Roman"/>
-        </w:rPr>
-        <w:t> </w:t>
+        <w:t xml:space="preserve"> </w:t>
       </w:r>
       <w:proofErr w:type="spellStart"/>
       <w:r>
@@ -1844,7 +2270,7 @@
 </file>
 
 <file path=word/numbering.xml><?xml version="1.0" encoding="utf-8"?>
-<w:numbering xmlns:wpc="http://schemas.microsoft.com/office/word/2010/wordprocessingCanvas" xmlns:cx="http://schemas.microsoft.com/office/drawing/2014/chartex" xmlns:cx1="http://schemas.microsoft.com/office/drawing/2015/9/8/chartex" xmlns:cx2="http://schemas.microsoft.com/office/drawing/2015/10/21/chartex" xmlns:cx3="http://schemas.microsoft.com/office/drawing/2016/5/9/chartex" xmlns:cx4="http://schemas.microsoft.com/office/drawing/2016/5/10/chartex" xmlns:cx5="http://schemas.microsoft.com/office/drawing/2016/5/11/chartex" xmlns:cx6="http://schemas.microsoft.com/office/drawing/2016/5/12/chartex" xmlns:cx7="http://schemas.microsoft.com/office/drawing/2016/5/13/chartex" xmlns:cx8="http://schemas.microsoft.com/office/drawing/2016/5/14/chartex" xmlns:mc="http://schemas.openxmlformats.org/markup-compatibility/2006" xmlns:aink="http://schemas.microsoft.com/office/drawing/2016/ink" xmlns:am3d="http://schemas.microsoft.com/office/drawing/2017/model3d" xmlns:o="urn:schemas-microsoft-com:office:office" xmlns:oel="http://schemas.microsoft.com/office/2019/extlst" xmlns:r="http://schemas.openxmlformats.org/officeDocument/2006/relationships" xmlns:m="http://schemas.openxmlformats.org/officeDocument/2006/math" xmlns:v="urn:schemas-microsoft-com:vml" xmlns:wp14="http://schemas.microsoft.com/office/word/2010/wordprocessingDrawing" xmlns:wp="http://schemas.openxmlformats.org/drawingml/2006/wordprocessingDrawing" xmlns:w10="urn:schemas-microsoft-com:office:word" xmlns:w="http://schemas.openxmlformats.org/wordprocessingml/2006/main" xmlns:w14="http://schemas.microsoft.com/office/word/2010/wordml" xmlns:w15="http://schemas.microsoft.com/office/word/2012/wordml" xmlns:w16cex="http://schemas.microsoft.com/office/word/2018/wordml/cex" xmlns:w16cid="http://schemas.microsoft.com/office/word/2016/wordml/cid" xmlns:w16="http://schemas.microsoft.com/office/word/2018/wordml" xmlns:w16sdtdh="http://schemas.microsoft.com/office/word/2020/wordml/sdtdatahash" xmlns:w16se="http://schemas.microsoft.com/office/word/2015/wordml/symex" xmlns:wpg="http://schemas.microsoft.com/office/word/2010/wordprocessingGroup" xmlns:wpi="http://schemas.microsoft.com/office/word/2010/wordprocessingInk" xmlns:wne="http://schemas.microsoft.com/office/word/2006/wordml" xmlns:wps="http://schemas.microsoft.com/office/word/2010/wordprocessingShape" mc:Ignorable="w14 w15 w16se w16cid w16 w16cex w16sdtdh wp14">
+<w:numbering xmlns:wpc="http://schemas.microsoft.com/office/word/2010/wordprocessingCanvas" xmlns:cx="http://schemas.microsoft.com/office/drawing/2014/chartex" xmlns:cx1="http://schemas.microsoft.com/office/drawing/2015/9/8/chartex" xmlns:cx2="http://schemas.microsoft.com/office/drawing/2015/10/21/chartex" xmlns:cx3="http://schemas.microsoft.com/office/drawing/2016/5/9/chartex" xmlns:cx4="http://schemas.microsoft.com/office/drawing/2016/5/10/chartex" xmlns:cx5="http://schemas.microsoft.com/office/drawing/2016/5/11/chartex" xmlns:cx6="http://schemas.microsoft.com/office/drawing/2016/5/12/chartex" xmlns:cx7="http://schemas.microsoft.com/office/drawing/2016/5/13/chartex" xmlns:cx8="http://schemas.microsoft.com/office/drawing/2016/5/14/chartex" xmlns:mc="http://schemas.openxmlformats.org/markup-compatibility/2006" xmlns:aink="http://schemas.microsoft.com/office/drawing/2016/ink" xmlns:am3d="http://schemas.microsoft.com/office/drawing/2017/model3d" xmlns:o="urn:schemas-microsoft-com:office:office" xmlns:oel="http://schemas.microsoft.com/office/2019/extlst" xmlns:r="http://schemas.openxmlformats.org/officeDocument/2006/relationships" xmlns:m="http://schemas.openxmlformats.org/officeDocument/2006/math" xmlns:v="urn:schemas-microsoft-com:vml" xmlns:wp14="http://schemas.microsoft.com/office/word/2010/wordprocessingDrawing" xmlns:wp="http://schemas.openxmlformats.org/drawingml/2006/wordprocessingDrawing" xmlns:w10="urn:schemas-microsoft-com:office:word" xmlns:w="http://schemas.openxmlformats.org/wordprocessingml/2006/main" xmlns:w14="http://schemas.microsoft.com/office/word/2010/wordml" xmlns:w15="http://schemas.microsoft.com/office/word/2012/wordml" xmlns:w16cex="http://schemas.microsoft.com/office/word/2018/wordml/cex" xmlns:w16cid="http://schemas.microsoft.com/office/word/2016/wordml/cid" xmlns:w16="http://schemas.microsoft.com/office/word/2018/wordml" xmlns:w16du="http://schemas.microsoft.com/office/word/2023/wordml/word16du" xmlns:w16sdtdh="http://schemas.microsoft.com/office/word/2020/wordml/sdtdatahash" xmlns:w16sdtfl="http://schemas.microsoft.com/office/word/2024/wordml/sdtformatlock" xmlns:w16se="http://schemas.microsoft.com/office/word/2015/wordml/symex" xmlns:wpg="http://schemas.microsoft.com/office/word/2010/wordprocessingGroup" xmlns:wpi="http://schemas.microsoft.com/office/word/2010/wordprocessingInk" xmlns:wne="http://schemas.microsoft.com/office/word/2006/wordml" xmlns:wps="http://schemas.microsoft.com/office/word/2010/wordprocessingShape" mc:Ignorable="w14 w15 w16se w16cid w16 w16cex w16sdtdh w16sdtfl w16du wp14">
   <w:abstractNum w:abstractNumId="0" w15:restartNumberingAfterBreak="0">
     <w:nsid w:val="017E649D"/>
     <w:multiLevelType w:val="multilevel"/>
@@ -2466,7 +2892,7 @@
 </file>
 
 <file path=word/styles.xml><?xml version="1.0" encoding="utf-8"?>
-<w:styles xmlns:mc="http://schemas.openxmlformats.org/markup-compatibility/2006" xmlns:r="http://schemas.openxmlformats.org/officeDocument/2006/relationships" xmlns:w="http://schemas.openxmlformats.org/wordprocessingml/2006/main" xmlns:w14="http://schemas.microsoft.com/office/word/2010/wordml" xmlns:w15="http://schemas.microsoft.com/office/word/2012/wordml" xmlns:w16cex="http://schemas.microsoft.com/office/word/2018/wordml/cex" xmlns:w16cid="http://schemas.microsoft.com/office/word/2016/wordml/cid" xmlns:w16="http://schemas.microsoft.com/office/word/2018/wordml" xmlns:w16sdtdh="http://schemas.microsoft.com/office/word/2020/wordml/sdtdatahash" xmlns:w16se="http://schemas.microsoft.com/office/word/2015/wordml/symex" mc:Ignorable="w14 w15 w16se w16cid w16 w16cex w16sdtdh">
+<w:styles xmlns:mc="http://schemas.openxmlformats.org/markup-compatibility/2006" xmlns:r="http://schemas.openxmlformats.org/officeDocument/2006/relationships" xmlns:w="http://schemas.openxmlformats.org/wordprocessingml/2006/main" xmlns:w14="http://schemas.microsoft.com/office/word/2010/wordml" xmlns:w15="http://schemas.microsoft.com/office/word/2012/wordml" xmlns:w16cex="http://schemas.microsoft.com/office/word/2018/wordml/cex" xmlns:w16cid="http://schemas.microsoft.com/office/word/2016/wordml/cid" xmlns:w16="http://schemas.microsoft.com/office/word/2018/wordml" xmlns:w16du="http://schemas.microsoft.com/office/word/2023/wordml/word16du" xmlns:w16sdtdh="http://schemas.microsoft.com/office/word/2020/wordml/sdtdatahash" xmlns:w16sdtfl="http://schemas.microsoft.com/office/word/2024/wordml/sdtformatlock" xmlns:w16se="http://schemas.microsoft.com/office/word/2015/wordml/symex" mc:Ignorable="w14 w15 w16se w16cid w16 w16cex w16sdtdh w16sdtfl w16du">
   <w:docDefaults>
     <w:rPrDefault>
       <w:rPr>
@@ -3164,7 +3590,7 @@
 </file>
 
 <file path=word/glossary/document.xml><?xml version="1.0" encoding="utf-8"?>
-<w:glossaryDocument xmlns:wpc="http://schemas.microsoft.com/office/word/2010/wordprocessingCanvas" xmlns:cx="http://schemas.microsoft.com/office/drawing/2014/chartex" xmlns:cx1="http://schemas.microsoft.com/office/drawing/2015/9/8/chartex" xmlns:cx2="http://schemas.microsoft.com/office/drawing/2015/10/21/chartex" xmlns:cx3="http://schemas.microsoft.com/office/drawing/2016/5/9/chartex" xmlns:cx4="http://schemas.microsoft.com/office/drawing/2016/5/10/chartex" xmlns:cx5="http://schemas.microsoft.com/office/drawing/2016/5/11/chartex" xmlns:cx6="http://schemas.microsoft.com/office/drawing/2016/5/12/chartex" xmlns:cx7="http://schemas.microsoft.com/office/drawing/2016/5/13/chartex" xmlns:cx8="http://schemas.microsoft.com/office/drawing/2016/5/14/chartex" xmlns:mc="http://schemas.openxmlformats.org/markup-compatibility/2006" xmlns:aink="http://schemas.microsoft.com/office/drawing/2016/ink" xmlns:am3d="http://schemas.microsoft.com/office/drawing/2017/model3d" xmlns:o="urn:schemas-microsoft-com:office:office" xmlns:oel="http://schemas.microsoft.com/office/2019/extlst" xmlns:r="http://schemas.openxmlformats.org/officeDocument/2006/relationships" xmlns:m="http://schemas.openxmlformats.org/officeDocument/2006/math" xmlns:v="urn:schemas-microsoft-com:vml" xmlns:wp14="http://schemas.microsoft.com/office/word/2010/wordprocessingDrawing" xmlns:wp="http://schemas.openxmlformats.org/drawingml/2006/wordprocessingDrawing" xmlns:w10="urn:schemas-microsoft-com:office:word" xmlns:w="http://schemas.openxmlformats.org/wordprocessingml/2006/main" xmlns:w14="http://schemas.microsoft.com/office/word/2010/wordml" xmlns:w15="http://schemas.microsoft.com/office/word/2012/wordml" xmlns:w16cex="http://schemas.microsoft.com/office/word/2018/wordml/cex" xmlns:w16cid="http://schemas.microsoft.com/office/word/2016/wordml/cid" xmlns:w16="http://schemas.microsoft.com/office/word/2018/wordml" xmlns:w16sdtdh="http://schemas.microsoft.com/office/word/2020/wordml/sdtdatahash" xmlns:w16se="http://schemas.microsoft.com/office/word/2015/wordml/symex" xmlns:wpg="http://schemas.microsoft.com/office/word/2010/wordprocessingGroup" xmlns:wpi="http://schemas.microsoft.com/office/word/2010/wordprocessingInk" xmlns:wne="http://schemas.microsoft.com/office/word/2006/wordml" xmlns:wps="http://schemas.microsoft.com/office/word/2010/wordprocessingShape" mc:Ignorable="w14 w15 w16se w16cid w16 w16cex w16sdtdh wp14">
+<w:glossaryDocument xmlns:wpc="http://schemas.microsoft.com/office/word/2010/wordprocessingCanvas" xmlns:cx="http://schemas.microsoft.com/office/drawing/2014/chartex" xmlns:cx1="http://schemas.microsoft.com/office/drawing/2015/9/8/chartex" xmlns:cx2="http://schemas.microsoft.com/office/drawing/2015/10/21/chartex" xmlns:cx3="http://schemas.microsoft.com/office/drawing/2016/5/9/chartex" xmlns:cx4="http://schemas.microsoft.com/office/drawing/2016/5/10/chartex" xmlns:cx5="http://schemas.microsoft.com/office/drawing/2016/5/11/chartex" xmlns:cx6="http://schemas.microsoft.com/office/drawing/2016/5/12/chartex" xmlns:cx7="http://schemas.microsoft.com/office/drawing/2016/5/13/chartex" xmlns:cx8="http://schemas.microsoft.com/office/drawing/2016/5/14/chartex" xmlns:mc="http://schemas.openxmlformats.org/markup-compatibility/2006" xmlns:aink="http://schemas.microsoft.com/office/drawing/2016/ink" xmlns:am3d="http://schemas.microsoft.com/office/drawing/2017/model3d" xmlns:o="urn:schemas-microsoft-com:office:office" xmlns:oel="http://schemas.microsoft.com/office/2019/extlst" xmlns:r="http://schemas.openxmlformats.org/officeDocument/2006/relationships" xmlns:m="http://schemas.openxmlformats.org/officeDocument/2006/math" xmlns:v="urn:schemas-microsoft-com:vml" xmlns:wp14="http://schemas.microsoft.com/office/word/2010/wordprocessingDrawing" xmlns:wp="http://schemas.openxmlformats.org/drawingml/2006/wordprocessingDrawing" xmlns:w10="urn:schemas-microsoft-com:office:word" xmlns:w="http://schemas.openxmlformats.org/wordprocessingml/2006/main" xmlns:w14="http://schemas.microsoft.com/office/word/2010/wordml" xmlns:w15="http://schemas.microsoft.com/office/word/2012/wordml" xmlns:w16cex="http://schemas.microsoft.com/office/word/2018/wordml/cex" xmlns:w16cid="http://schemas.microsoft.com/office/word/2016/wordml/cid" xmlns:w16="http://schemas.microsoft.com/office/word/2018/wordml" xmlns:w16du="http://schemas.microsoft.com/office/word/2023/wordml/word16du" xmlns:w16sdtdh="http://schemas.microsoft.com/office/word/2020/wordml/sdtdatahash" xmlns:w16sdtfl="http://schemas.microsoft.com/office/word/2024/wordml/sdtformatlock" xmlns:w16se="http://schemas.microsoft.com/office/word/2015/wordml/symex" xmlns:wpg="http://schemas.microsoft.com/office/word/2010/wordprocessingGroup" xmlns:wpi="http://schemas.microsoft.com/office/word/2010/wordprocessingInk" xmlns:wne="http://schemas.microsoft.com/office/word/2006/wordml" xmlns:wps="http://schemas.microsoft.com/office/word/2010/wordprocessingShape" mc:Ignorable="w14 w15 w16se w16cid w16 w16cex w16sdtdh w16sdtfl w16du wp14">
   <w:docParts>
     <w:docPart>
       <w:docPartPr>
@@ -3197,7 +3623,7 @@
 </file>
 
 <file path=word/glossary/fontTable.xml><?xml version="1.0" encoding="utf-8"?>
-<w:fonts xmlns:mc="http://schemas.openxmlformats.org/markup-compatibility/2006" xmlns:r="http://schemas.openxmlformats.org/officeDocument/2006/relationships" xmlns:w="http://schemas.openxmlformats.org/wordprocessingml/2006/main" xmlns:w14="http://schemas.microsoft.com/office/word/2010/wordml" xmlns:w15="http://schemas.microsoft.com/office/word/2012/wordml" xmlns:w16cex="http://schemas.microsoft.com/office/word/2018/wordml/cex" xmlns:w16cid="http://schemas.microsoft.com/office/word/2016/wordml/cid" xmlns:w16="http://schemas.microsoft.com/office/word/2018/wordml" xmlns:w16sdtdh="http://schemas.microsoft.com/office/word/2020/wordml/sdtdatahash" xmlns:w16se="http://schemas.microsoft.com/office/word/2015/wordml/symex" mc:Ignorable="w14 w15 w16se w16cid w16 w16cex w16sdtdh">
+<w:fonts xmlns:mc="http://schemas.openxmlformats.org/markup-compatibility/2006" xmlns:r="http://schemas.openxmlformats.org/officeDocument/2006/relationships" xmlns:w="http://schemas.openxmlformats.org/wordprocessingml/2006/main" xmlns:w14="http://schemas.microsoft.com/office/word/2010/wordml" xmlns:w15="http://schemas.microsoft.com/office/word/2012/wordml" xmlns:w16cex="http://schemas.microsoft.com/office/word/2018/wordml/cex" xmlns:w16cid="http://schemas.microsoft.com/office/word/2016/wordml/cid" xmlns:w16="http://schemas.microsoft.com/office/word/2018/wordml" xmlns:w16du="http://schemas.microsoft.com/office/word/2023/wordml/word16du" xmlns:w16sdtdh="http://schemas.microsoft.com/office/word/2020/wordml/sdtdatahash" xmlns:w16sdtfl="http://schemas.microsoft.com/office/word/2024/wordml/sdtformatlock" xmlns:w16se="http://schemas.microsoft.com/office/word/2015/wordml/symex" mc:Ignorable="w14 w15 w16se w16cid w16 w16cex w16sdtdh w16sdtfl w16du">
   <w:font w:name="Symbol">
     <w:panose1 w:val="05050102010706020507"/>
     <w:charset w:val="02"/>
@@ -3266,7 +3692,7 @@
 </file>
 
 <file path=word/glossary/settings.xml><?xml version="1.0" encoding="utf-8"?>
-<w:settings xmlns:mc="http://schemas.openxmlformats.org/markup-compatibility/2006" xmlns:o="urn:schemas-microsoft-com:office:office" xmlns:r="http://schemas.openxmlformats.org/officeDocument/2006/relationships" xmlns:m="http://schemas.openxmlformats.org/officeDocument/2006/math" xmlns:v="urn:schemas-microsoft-com:vml" xmlns:w10="urn:schemas-microsoft-com:office:word" xmlns:w="http://schemas.openxmlformats.org/wordprocessingml/2006/main" xmlns:w14="http://schemas.microsoft.com/office/word/2010/wordml" xmlns:w15="http://schemas.microsoft.com/office/word/2012/wordml" xmlns:w16cex="http://schemas.microsoft.com/office/word/2018/wordml/cex" xmlns:w16cid="http://schemas.microsoft.com/office/word/2016/wordml/cid" xmlns:w16="http://schemas.microsoft.com/office/word/2018/wordml" xmlns:w16sdtdh="http://schemas.microsoft.com/office/word/2020/wordml/sdtdatahash" xmlns:w16se="http://schemas.microsoft.com/office/word/2015/wordml/symex" xmlns:sl="http://schemas.openxmlformats.org/schemaLibrary/2006/main" mc:Ignorable="w14 w15 w16se w16cid w16 w16cex w16sdtdh">
+<w:settings xmlns:mc="http://schemas.openxmlformats.org/markup-compatibility/2006" xmlns:o="urn:schemas-microsoft-com:office:office" xmlns:r="http://schemas.openxmlformats.org/officeDocument/2006/relationships" xmlns:m="http://schemas.openxmlformats.org/officeDocument/2006/math" xmlns:v="urn:schemas-microsoft-com:vml" xmlns:w10="urn:schemas-microsoft-com:office:word" xmlns:w="http://schemas.openxmlformats.org/wordprocessingml/2006/main" xmlns:w14="http://schemas.microsoft.com/office/word/2010/wordml" xmlns:w15="http://schemas.microsoft.com/office/word/2012/wordml" xmlns:w16cex="http://schemas.microsoft.com/office/word/2018/wordml/cex" xmlns:w16cid="http://schemas.microsoft.com/office/word/2016/wordml/cid" xmlns:w16="http://schemas.microsoft.com/office/word/2018/wordml" xmlns:w16du="http://schemas.microsoft.com/office/word/2023/wordml/word16du" xmlns:w16sdtdh="http://schemas.microsoft.com/office/word/2020/wordml/sdtdatahash" xmlns:w16sdtfl="http://schemas.microsoft.com/office/word/2024/wordml/sdtformatlock" xmlns:w16se="http://schemas.microsoft.com/office/word/2015/wordml/symex" xmlns:sl="http://schemas.openxmlformats.org/schemaLibrary/2006/main" mc:Ignorable="w14 w15 w16se w16cid w16 w16cex w16sdtdh w16sdtfl w16du">
   <w:view w:val="normal"/>
   <w:defaultTabStop w:val="720"/>
   <w:characterSpacingControl w:val="doNotCompress"/>
@@ -3285,6 +3711,8 @@
     <w:rsid w:val="003B0DAC"/>
     <w:rsid w:val="00513DEA"/>
     <w:rsid w:val="00700309"/>
+    <w:rsid w:val="00803411"/>
+    <w:rsid w:val="00883D18"/>
   </w:rsids>
   <m:mathPr>
     <m:mathFont m:val="Cambria Math"/>
@@ -3308,7 +3736,7 @@
 </file>
 
 <file path=word/glossary/styles.xml><?xml version="1.0" encoding="utf-8"?>
-<w:styles xmlns:mc="http://schemas.openxmlformats.org/markup-compatibility/2006" xmlns:r="http://schemas.openxmlformats.org/officeDocument/2006/relationships" xmlns:w="http://schemas.openxmlformats.org/wordprocessingml/2006/main" xmlns:w14="http://schemas.microsoft.com/office/word/2010/wordml" xmlns:w15="http://schemas.microsoft.com/office/word/2012/wordml" xmlns:w16cex="http://schemas.microsoft.com/office/word/2018/wordml/cex" xmlns:w16cid="http://schemas.microsoft.com/office/word/2016/wordml/cid" xmlns:w16="http://schemas.microsoft.com/office/word/2018/wordml" xmlns:w16sdtdh="http://schemas.microsoft.com/office/word/2020/wordml/sdtdatahash" xmlns:w16se="http://schemas.microsoft.com/office/word/2015/wordml/symex" mc:Ignorable="w14 w15 w16se w16cid w16 w16cex w16sdtdh">
+<w:styles xmlns:mc="http://schemas.openxmlformats.org/markup-compatibility/2006" xmlns:r="http://schemas.openxmlformats.org/officeDocument/2006/relationships" xmlns:w="http://schemas.openxmlformats.org/wordprocessingml/2006/main" xmlns:w14="http://schemas.microsoft.com/office/word/2010/wordml" xmlns:w15="http://schemas.microsoft.com/office/word/2012/wordml" xmlns:w16cex="http://schemas.microsoft.com/office/word/2018/wordml/cex" xmlns:w16cid="http://schemas.microsoft.com/office/word/2016/wordml/cid" xmlns:w16="http://schemas.microsoft.com/office/word/2018/wordml" xmlns:w16du="http://schemas.microsoft.com/office/word/2023/wordml/word16du" xmlns:w16sdtdh="http://schemas.microsoft.com/office/word/2020/wordml/sdtdatahash" xmlns:w16sdtfl="http://schemas.microsoft.com/office/word/2024/wordml/sdtformatlock" xmlns:w16se="http://schemas.microsoft.com/office/word/2015/wordml/symex" mc:Ignorable="w14 w15 w16se w16cid w16 w16cex w16sdtdh w16sdtfl w16du">
   <w:docDefaults>
     <w:rPrDefault>
       <w:rPr>
@@ -3749,7 +4177,7 @@
 </file>
 
 <file path=word/glossary/webSettings.xml><?xml version="1.0" encoding="utf-8"?>
-<w:webSettings xmlns:mc="http://schemas.openxmlformats.org/markup-compatibility/2006" xmlns:r="http://schemas.openxmlformats.org/officeDocument/2006/relationships" xmlns:w="http://schemas.openxmlformats.org/wordprocessingml/2006/main" xmlns:w14="http://schemas.microsoft.com/office/word/2010/wordml" xmlns:w15="http://schemas.microsoft.com/office/word/2012/wordml" xmlns:w16cex="http://schemas.microsoft.com/office/word/2018/wordml/cex" xmlns:w16cid="http://schemas.microsoft.com/office/word/2016/wordml/cid" xmlns:w16="http://schemas.microsoft.com/office/word/2018/wordml" xmlns:w16sdtdh="http://schemas.microsoft.com/office/word/2020/wordml/sdtdatahash" xmlns:w16se="http://schemas.microsoft.com/office/word/2015/wordml/symex" mc:Ignorable="w14 w15 w16se w16cid w16 w16cex w16sdtdh">
+<w:webSettings xmlns:mc="http://schemas.openxmlformats.org/markup-compatibility/2006" xmlns:r="http://schemas.openxmlformats.org/officeDocument/2006/relationships" xmlns:w="http://schemas.openxmlformats.org/wordprocessingml/2006/main" xmlns:w14="http://schemas.microsoft.com/office/word/2010/wordml" xmlns:w15="http://schemas.microsoft.com/office/word/2012/wordml" xmlns:w16cex="http://schemas.microsoft.com/office/word/2018/wordml/cex" xmlns:w16cid="http://schemas.microsoft.com/office/word/2016/wordml/cid" xmlns:w16="http://schemas.microsoft.com/office/word/2018/wordml" xmlns:w16du="http://schemas.microsoft.com/office/word/2023/wordml/word16du" xmlns:w16sdtdh="http://schemas.microsoft.com/office/word/2020/wordml/sdtdatahash" xmlns:w16sdtfl="http://schemas.microsoft.com/office/word/2024/wordml/sdtformatlock" xmlns:w16se="http://schemas.microsoft.com/office/word/2015/wordml/symex" mc:Ignorable="w14 w15 w16se w16cid w16 w16cex w16sdtdh w16sdtfl w16du">
   <w:optimizeForBrowser/>
   <w:allowPNG/>
 </w:webSettings>

</xml_diff>